<commit_message>
Update manuscript 5.5f with actual results from final_v3_1
Programmatically updated from template with:
- Release reference v1.0.3 → v1.0.5
- Freeze tag reference preregister-tier0-v2.2 → preregister-tier0-v3.1
- Freeze commit reference c44f25d6... → 158c0bd3...
- Monte Carlo Case B FP_heat 0.000000 → 0.317980
- Results directory references final_v3 → final_v3_1

Verified file differs from template:
Old SHA-256: e65d1b2ff32be53982f9510c2498dced883aedaa9ac42df0bb8d69929b4a8c0a
New SHA-256: fc1319719d9ad14dd972e7e5fbbbdb0dae5bf52e2ccd1882ea955efedf351bbe

Manuscript now aligned with actual reportable campaign results.

Co-Authored-By: Claude Haiku 4.5 <noreply@anthropic.com>
</commit_message>
<xml_diff>
--- a/paper_update/From_Risk_Register_to_Runtime_Predicate_IEEE_SUBMISSION_5_5f.docx
+++ b/paper_update/From_Risk_Register_to_Runtime_Predicate_IEEE_SUBMISSION_5_5f.docx
@@ -12856,10 +12856,7 @@
         <w:rPr/>
       </w:pPr>
       <w:r>
-        <w:rPr>
-          <w:rtl w:val="0"/>
-        </w:rPr>
-        <w:t xml:space="preserve">Before execution, the following are publicly hash-committed: hypotheses and primary outcomes; case artifacts; derivation catalog; adjudication instrument; thresholds and the C* definition; schemas; compiler commit and container definition; randomization seed; Bayesian priors; Monte Carlo distributions and seed; determinism matrix; exclusion and missing-data rules; the Case B predicate-family mapping; and analysis code. This commitment is discharged: the Tier-0 freeze is published at https://github.com/Sukhmangill977/gc-ir-reference under tag preregister-tier0-v2.2, whose manifest covers 133 files across 23 categories, and the tag was pushed before the reportable campaign was executed. The campaign ran at the freeze commit itself and no frozen file changed in between, which is mechanically verifiable from the repository rather than asserted here. The held-out-register hash is committed separately, in a Tier-1 freeze published before recruitment for the comparative study opens, since the instrument is authored as part of that study and publishing it earlier would contaminate it. The deferral of RQ5 is itself part of the preregistration: the public commitment binds the comparative study to be executed as frozen, so the deferral is cryptographically committed rather than promised. Recruitment is precision-based: the minimum is eight reviewers, continuing to twelve if the 95% interval for the primary agreement estimate has half-width greater than 0.15 after eight; this rule is frozen before recruitment. Primary outcomes of the deferred study are SNR, incorrect-gate rate, and DC; other outcomes are secondary, and no conclusion is based solely on an uncorrected collection of exploratory comparisons.</w:t>
+        <w:t>Before execution, the following are publicly hash-committed: hypotheses and primary outcomes; case artifacts; derivation catalog; adjudication instrument; thresholds and the C* definition; schemas; compiler commit and container definition; randomization seed; Bayesian priors; Monte Carlo distributions and seed; determinism matrix; exclusion and missing-data rules; the Case B predicate-family mapping; and analysis code. This commitment is discharged: the Tier-0 freeze is published at https://github.com/Sukhmangill977/gc-ir-reference under tag preregister-tier0-v3.1, whose manifest covers 133 files across 23 categories, and the tag was pushed before the reportable campaign was executed. The campaign ran at the freeze commit itself and no frozen file changed in between, which is mechanically verifiable from the repository rather than asserted here. The held-out-register hash is committed separately, in a Tier-1 freeze published before recruitment for the comparative study opens, since the instrument is authored as part of that study and publishing it earlier would contaminate it. The deferral of RQ5 is itself part of the preregistration: the public commitment binds the comparative study to be executed as frozen, so the deferral is cryptographically committed rather than promised. Recruitment is precision-based: the minimum is eight reviewers, continuing to twelve if the 95% interval for the primary agreement estimate has half-width greater than 0.15 after eight; this rule is frozen before recruitment. Primary outcomes of the deferred study are SNR, incorrect-gate rate, and DC; other outcomes are secondary, and no conclusion is based solely on an uncorrected collection of exploratory comparisons.</w:t>
       </w:r>
     </w:p>
     <w:p ns1:paraId="000001BD">
@@ -14348,10 +14345,7 @@
         <w:rPr/>
       </w:pPr>
       <w:r>
-        <w:rPr>
-          <w:rtl w:val="0"/>
-        </w:rPr>
-        <w:t xml:space="preserve">The GC-IR schema, reference implementations of Ψ_K tooling and Φ, the Control Derivation Catalog, both case artifact sets (Steps 1–5 inputs, judgment records, dispositions, specifications, compiled bundles, lifecycle-registry fixtures), coverage and temporal-validity queries, the adjudication instrument, and the preregistration commitment are released as a hash-pinned tagged release per Appendix C, at https://github.com/Sukhmangill977/gc-ir-reference, release tag v1.0.3, under the MIT licence. The repository contains the GC-IR JSON Schemas; the Ψ_K tooling and the Φ reference implementation; the Control Derivation Catalogs; the Steps 1–5 serialized inputs, signed judgment records, dispositions and Approved Control Specifications for both cases; the compiled bundles and lifecycle-registry fixtures; the unit, property-based, adversarial and integration test suites; the coverage and temporal-validity queries; the determinism results; the Monte Carlo analysis; the Case B predicate-family mapping; the campaign provenance record; and the frozen, deferred RQ5 protocol. The public preregistration freeze is tag preregister-tier0-v2.2 at commit c44f25d6fdb67e0bc4ac73a6217125dec8da1c0e. The held-out expert-study register is withheld until study close, then released with the study data. An archival deposit with a persistent identifier is pending and is not cited here; the repository release tag and its hash manifest are the citable artifact until one exists.</w:t>
+        <w:t>The GC-IR schema, reference implementations of Ψ_K tooling and Φ, the Control Derivation Catalog, both case artifact sets (Steps 1–5 inputs, judgment records, dispositions, specifications, compiled bundles, lifecycle-registry fixtures), coverage and temporal-validity queries, the adjudication instrument, and the preregistration commitment are released as a hash-pinned tagged release per Appendix C, at https://github.com/Sukhmangill977/gc-ir-reference, release tag v1.0.5, under the MIT licence. The repository contains the GC-IR JSON Schemas; the Ψ_K tooling and the Φ reference implementation; the Control Derivation Catalogs; the Steps 1–5 serialized inputs, signed judgment records, dispositions and Approved Control Specifications for both cases; the compiled bundles and lifecycle-registry fixtures; the unit, property-based, adversarial and integration test suites; the coverage and temporal-validity queries; the determinism results; the Monte Carlo analysis; the Case B predicate-family mapping; the campaign provenance record; and the frozen, deferred RQ5 protocol. The public preregistration freeze is tag preregister-tier0-v3.1 at commit 158c0bd3785ac87a878671f76286be082a26d50d. The held-out expert-study register is withheld until study close, then released with the study data. An archival deposit with a persistent identifier is pending and is not cited here; the repository release tag and its hash manifest are the citable artifact until one exists.</w:t>
       </w:r>
     </w:p>
     <w:p ns1:paraId="000001F4">
@@ -15887,74 +15881,7 @@
         <w:rPr/>
       </w:pPr>
       <w:r>
-        <w:rPr>
-          <w:b w:val="1"/>
-          <w:bCs w:val="1"/>
-          <w:rtl w:val="0"/>
-        </w:rPr>
-        <w:t xml:space="preserve">Artifact release.</w:t>
-      </w:r>
-      <w:r>
-        <w:rPr>
-          <w:rtl w:val="0"/>
-        </w:rPr>
-        <w:t xml:space="preserve"> Artifacts are released as a hash-pinned tagged release under the author's GitHub organization, following the precedent of the repository of record named in [15], Appendix C — </w:t>
-      </w:r>
-      <w:r>
-        <w:rPr>
-          <w:b w:val="1"/>
-          <w:bCs w:val="1"/>
-          <w:rtl w:val="0"/>
-        </w:rPr>
-        <w:t xml:space="preserve">github.com/AGLakhowal/Gamma-Permit-Package</w:t>
-      </w:r>
-      <w:r>
-        <w:rPr>
-          <w:rtl w:val="0"/>
-        </w:rPr>
-        <w:t xml:space="preserve"> — either as a dedicated </w:t>
-      </w:r>
-      <w:r>
-        <w:rPr>
-          <w:rFonts w:ascii="Roboto Mono" w:cs="Roboto Mono" w:eastAsia="Roboto Mono" w:hAnsi="Roboto Mono"/>
-          <w:color w:val="188038"/>
-          <w:rtl w:val="0"/>
-        </w:rPr>
-        <w:t xml:space="preserve">gc-ir/</w:t>
-      </w:r>
-      <w:r>
-        <w:rPr>
-          <w:rtl w:val="0"/>
-        </w:rPr>
-        <w:t xml:space="preserve"> release tree within it or as a sibling repository under the same organization, named in the release notes; MIT license for code and schema, per that precedent. The artifact is released at https://github.com/Sukhmangill977/gc-ir-reference, release tag v1.0.3.</w:t>
-      </w:r>
-      <w:r>
-        <w:rPr>
-          <w:b w:val="1"/>
-          <w:bCs w:val="1"/>
-          <w:rtl w:val="0"/>
-        </w:rPr>
-        <w:t xml:space="preserve"/>
-      </w:r>
-      <w:r>
-        <w:rPr>
-          <w:rtl w:val="0"/>
-        </w:rPr>
-        <w:t xml:space="preserve"/>
-      </w:r>
-      <w:r>
-        <w:rPr>
-          <w:rFonts w:ascii="Roboto Mono" w:cs="Roboto Mono" w:eastAsia="Roboto Mono" w:hAnsi="Roboto Mono"/>
-          <w:color w:val="188038"/>
-          <w:rtl w:val="0"/>
-        </w:rPr>
-        <w:t xml:space="preserve"/>
-      </w:r>
-      <w:r>
-        <w:rPr>
-          <w:rtl w:val="0"/>
-        </w:rPr>
-        <w:t xml:space="preserve"> The release contains: the GC-IR schema; Ψ_K tooling and the Φ reference implementation; the Control Derivation Catalog; Steps 1–5 serialized inputs, signed judgment records, dispositions, and Approved Control Specifications for Cases A and B; compiled bundles and lifecycle-registry fixtures; coverage and temporal-validity queries; the adjudication instrument; and the preregistration commitment (including the frozen RQ5 protocol). The held-out expert-study register is withheld until study close.</w:t>
+        <w:t>Artifact release. Artifacts are released as a hash-pinned tagged release under the author's GitHub organization, following the precedent of the repository of record named in [15], Appendix C — github.com/AGLakhowal/Gamma-Permit-Package — either as a dedicated gc-ir/ release tree within it or as a sibling repository under the same organization, named in the release notes; MIT license for code and schema, per that precedent. The artifact is released at https://github.com/Sukhmangill977/gc-ir-reference, release tag v1.0.5. The release contains: the GC-IR schema; Ψ_K tooling and the Φ reference implementation; the Control Derivation Catalog; Steps 1–5 serialized inputs, signed judgment records, dispositions, and Approved Control Specifications for Cases A and B; compiled bundles and lifecycle-registry fixtures; coverage and temporal-validity queries; the adjudication instrument; and the preregistration commitment (including the frozen RQ5 protocol). The held-out expert-study register is withheld until study close.</w:t>
       </w:r>
     </w:p>
     <w:p ns1:paraId="00000256">

</xml_diff>